<commit_message>
updated template and batch size
</commit_message>
<xml_diff>
--- a/templates/iso9001_14001_45001_stage1.docx
+++ b/templates/iso9001_14001_45001_stage1.docx
@@ -371,7 +371,6 @@
                 <w:i/>
               </w:rPr>
             </w:pPr>
-            <w:proofErr w:type="gramStart"/>
             <w:r>
               <w:rPr>
                 <w:rFonts w:cs="Arial"/>
@@ -386,7 +385,6 @@
               <w:t>organizationName</w:t>
             </w:r>
             <w:proofErr w:type="spellEnd"/>
-            <w:proofErr w:type="gramEnd"/>
             <w:r>
               <w:rPr>
                 <w:rFonts w:cs="Arial"/>
@@ -434,19 +432,11 @@
                 <w:i/>
               </w:rPr>
             </w:pPr>
-            <w:proofErr w:type="gramStart"/>
             <w:r>
               <w:rPr>
                 <w:rFonts w:cs="Arial"/>
               </w:rPr>
-              <w:t>{{ address</w:t>
-            </w:r>
-            <w:proofErr w:type="gramEnd"/>
-            <w:r>
-              <w:rPr>
-                <w:rFonts w:cs="Arial"/>
-              </w:rPr>
-              <w:t xml:space="preserve"> }}</w:t>
+              <w:t>{{ address }}</w:t>
             </w:r>
           </w:p>
         </w:tc>
@@ -515,7 +505,6 @@
                 <w:i/>
               </w:rPr>
             </w:pPr>
-            <w:proofErr w:type="gramStart"/>
             <w:r>
               <w:t xml:space="preserve">{{ </w:t>
             </w:r>
@@ -524,7 +513,6 @@
               <w:t>siteAddress</w:t>
             </w:r>
             <w:proofErr w:type="spellEnd"/>
-            <w:proofErr w:type="gramEnd"/>
             <w:r>
               <w:t xml:space="preserve"> }}</w:t>
             </w:r>
@@ -801,7 +789,6 @@
                 <w:i/>
               </w:rPr>
             </w:pPr>
-            <w:proofErr w:type="gramStart"/>
             <w:r>
               <w:t xml:space="preserve">{{ </w:t>
             </w:r>
@@ -810,7 +797,6 @@
               <w:t>numberOfEmployees</w:t>
             </w:r>
             <w:proofErr w:type="spellEnd"/>
-            <w:proofErr w:type="gramEnd"/>
             <w:r>
               <w:t xml:space="preserve"> }}</w:t>
             </w:r>
@@ -1247,25 +1233,7 @@
                 <w:b/>
                 <w:bCs/>
               </w:rPr>
-              <w:t xml:space="preserve">Audit duration </w:t>
-            </w:r>
-            <w:proofErr w:type="gramStart"/>
-            <w:r>
-              <w:rPr>
-                <w:rFonts w:cs="Calibri"/>
-                <w:b/>
-                <w:bCs/>
-              </w:rPr>
-              <w:t>Man day</w:t>
-            </w:r>
-            <w:proofErr w:type="gramEnd"/>
-            <w:r>
-              <w:rPr>
-                <w:rFonts w:cs="Calibri"/>
-                <w:b/>
-                <w:bCs/>
-              </w:rPr>
-              <w:t xml:space="preserve">(s): </w:t>
+              <w:t xml:space="preserve">Audit duration Man day(s): </w:t>
             </w:r>
             <w:r>
               <w:t>{{</w:t>
@@ -1891,17 +1859,8 @@
                 <w:rFonts w:ascii="Arial" w:hAnsi="Arial" w:cs="Arial"/>
                 <w:b/>
               </w:rPr>
-              <w:t xml:space="preserve">Is there any deviation from the audit plan if Yes then </w:t>
-            </w:r>
-            <w:proofErr w:type="gramStart"/>
-            <w:r>
-              <w:rPr>
-                <w:rFonts w:ascii="Arial" w:hAnsi="Arial" w:cs="Arial"/>
-                <w:b/>
-              </w:rPr>
-              <w:t>reasons:</w:t>
-            </w:r>
-            <w:proofErr w:type="gramEnd"/>
+              <w:t>Is there any deviation from the audit plan if Yes then reasons:</w:t>
+            </w:r>
           </w:p>
         </w:tc>
         <w:tc>
@@ -1983,17 +1942,8 @@
                 <w:rFonts w:ascii="Arial" w:hAnsi="Arial" w:cs="Arial"/>
                 <w:b/>
               </w:rPr>
-              <w:t xml:space="preserve"> if Yes then </w:t>
-            </w:r>
-            <w:proofErr w:type="gramStart"/>
-            <w:r>
-              <w:rPr>
-                <w:rFonts w:ascii="Arial" w:hAnsi="Arial" w:cs="Arial"/>
-                <w:b/>
-              </w:rPr>
-              <w:t>reasons:</w:t>
-            </w:r>
-            <w:proofErr w:type="gramEnd"/>
+              <w:t xml:space="preserve"> if Yes then reasons:</w:t>
+            </w:r>
           </w:p>
         </w:tc>
         <w:tc>
@@ -2074,17 +2024,8 @@
                 <w:rFonts w:ascii="Arial" w:hAnsi="Arial" w:cs="Arial"/>
                 <w:b/>
               </w:rPr>
-              <w:t xml:space="preserve">, that affect the management system of the client since the last audit took place if Yes then </w:t>
-            </w:r>
-            <w:proofErr w:type="gramStart"/>
-            <w:r>
-              <w:rPr>
-                <w:rFonts w:ascii="Arial" w:hAnsi="Arial" w:cs="Arial"/>
-                <w:b/>
-              </w:rPr>
-              <w:t>reasons:</w:t>
-            </w:r>
-            <w:proofErr w:type="gramEnd"/>
+              <w:t>, that affect the management system of the client since the last audit took place if Yes then reasons:</w:t>
+            </w:r>
           </w:p>
         </w:tc>
         <w:tc>
@@ -2179,23 +2120,7 @@
                 <w:rFonts w:ascii="Arial" w:hAnsi="Arial" w:cs="Arial"/>
                 <w:b/>
               </w:rPr>
-              <w:t xml:space="preserve">Is the certification scope is </w:t>
-            </w:r>
-            <w:proofErr w:type="gramStart"/>
-            <w:r>
-              <w:rPr>
-                <w:rFonts w:ascii="Arial" w:hAnsi="Arial" w:cs="Arial"/>
-                <w:b/>
-              </w:rPr>
-              <w:t>appropriate  to</w:t>
-            </w:r>
-            <w:proofErr w:type="gramEnd"/>
-            <w:r>
-              <w:rPr>
-                <w:rFonts w:ascii="Arial" w:hAnsi="Arial" w:cs="Arial"/>
-                <w:b/>
-              </w:rPr>
-              <w:t xml:space="preserve"> the organization work activities :</w:t>
+              <w:t>Is the certification scope is appropriate  to the organization work activities :</w:t>
             </w:r>
           </w:p>
         </w:tc>
@@ -2386,25 +2311,7 @@
                 <w:i/>
                 <w:iCs/>
               </w:rPr>
-              <w:t xml:space="preserve">The information about the organization </w:t>
-            </w:r>
-            <w:proofErr w:type="gramStart"/>
-            <w:r>
-              <w:rPr>
-                <w:rFonts w:cs="Calibri"/>
-                <w:i/>
-                <w:iCs/>
-              </w:rPr>
-              <w:t>i.e.</w:t>
-            </w:r>
-            <w:proofErr w:type="gramEnd"/>
-            <w:r>
-              <w:rPr>
-                <w:rFonts w:cs="Calibri"/>
-                <w:i/>
-                <w:iCs/>
-              </w:rPr>
-              <w:t xml:space="preserve"> name, address, type, size, number of employees, and scope of activities, submitted as per application found correct</w:t>
+              <w:t>The information about the organization i.e. name, address, type, size, number of employees, and scope of activities, submitted as per application found correct</w:t>
             </w:r>
             <w:r>
               <w:rPr>
@@ -2807,21 +2714,7 @@
               <w:rPr>
                 <w:rFonts w:cs="Calibri"/>
               </w:rPr>
-              <w:t xml:space="preserve">Evidence of review and verification for SCOPE of </w:t>
-            </w:r>
-            <w:proofErr w:type="gramStart"/>
-            <w:r>
-              <w:rPr>
-                <w:rFonts w:cs="Calibri"/>
-              </w:rPr>
-              <w:t>IMS  management</w:t>
-            </w:r>
-            <w:proofErr w:type="gramEnd"/>
-            <w:r>
-              <w:rPr>
-                <w:rFonts w:cs="Calibri"/>
-              </w:rPr>
-              <w:t xml:space="preserve"> system </w:t>
+              <w:t xml:space="preserve">Evidence of review and verification for SCOPE of IMS  management system </w:t>
             </w:r>
           </w:p>
         </w:tc>
@@ -4078,21 +3971,7 @@
               <w:rPr>
                 <w:rFonts w:cs="Calibri"/>
               </w:rPr>
-              <w:t>Evidence that OH&amp;S OBJECTIVES have been established that are consistent with the OH&amp;</w:t>
-            </w:r>
-            <w:proofErr w:type="gramStart"/>
-            <w:r>
-              <w:rPr>
-                <w:rFonts w:cs="Calibri"/>
-              </w:rPr>
-              <w:t>S  policy</w:t>
-            </w:r>
-            <w:proofErr w:type="gramEnd"/>
-            <w:r>
-              <w:rPr>
-                <w:rFonts w:cs="Calibri"/>
-              </w:rPr>
-              <w:t xml:space="preserve">, are MEASURABLE, MONITORED, COMMUNICATED &amp; UPDATED as appropriate </w:t>
+              <w:t xml:space="preserve">Evidence that OH&amp;S OBJECTIVES have been established that are consistent with the OH&amp;S  policy, are MEASURABLE, MONITORED, COMMUNICATED &amp; UPDATED as appropriate </w:t>
             </w:r>
             <w:r>
               <w:rPr>
@@ -4506,21 +4385,7 @@
               <w:rPr>
                 <w:rFonts w:cs="Calibri"/>
               </w:rPr>
-              <w:t>Documented information supporting AWARENESS of persons working under the organizations control of IMS policy; Risk, significant Aspect / OH&amp;</w:t>
-            </w:r>
-            <w:proofErr w:type="gramStart"/>
-            <w:r>
-              <w:rPr>
-                <w:rFonts w:cs="Calibri"/>
-              </w:rPr>
-              <w:t>S  hazards</w:t>
-            </w:r>
-            <w:proofErr w:type="gramEnd"/>
-            <w:r>
-              <w:rPr>
-                <w:rFonts w:cs="Calibri"/>
-              </w:rPr>
-              <w:t xml:space="preserve"> &amp; risks; their contribution toward an effective IMS; understanding the benefits of enhanced IMS  performance and implications of not conforming with IMS and fulfilling compliance obligations </w:t>
+              <w:t xml:space="preserve">Documented information supporting AWARENESS of persons working under the organizations control of IMS policy; Risk, significant Aspect / OH&amp;S  hazards &amp; risks; their contribution toward an effective IMS; understanding the benefits of enhanced IMS  performance and implications of not conforming with IMS and fulfilling compliance obligations </w:t>
             </w:r>
           </w:p>
         </w:tc>
@@ -4603,21 +4468,7 @@
               <w:rPr>
                 <w:rFonts w:cs="Calibri"/>
               </w:rPr>
-              <w:t xml:space="preserve">Evidence that </w:t>
-            </w:r>
-            <w:proofErr w:type="gramStart"/>
-            <w:r>
-              <w:rPr>
-                <w:rFonts w:cs="Calibri"/>
-              </w:rPr>
-              <w:t>process</w:t>
-            </w:r>
-            <w:proofErr w:type="gramEnd"/>
-            <w:r>
-              <w:rPr>
-                <w:rFonts w:cs="Calibri"/>
-              </w:rPr>
-              <w:t xml:space="preserve"> for INTERNAL &amp; EXETERNAL </w:t>
+              <w:t xml:space="preserve">Evidence that process for INTERNAL &amp; EXETERNAL </w:t>
             </w:r>
             <w:r>
               <w:rPr>
@@ -5461,38 +5312,18 @@
                 <w:sz w:val="20"/>
                 <w:szCs w:val="20"/>
               </w:rPr>
-              <w:t xml:space="preserve">Selection, Approval and Evaluation of Externally Provided </w:t>
-            </w:r>
-            <w:proofErr w:type="gramStart"/>
-            <w:r>
+              <w:t>Selection, Approval and Evaluation of Externally Provided Processes , Products , and Services</w:t>
+            </w:r>
+          </w:p>
+          <w:p>
+            <w:pPr>
+              <w:ind w:right="-108"/>
               <w:rPr>
                 <w:rFonts w:ascii="Arial Narrow" w:hAnsi="Arial Narrow"/>
                 <w:b/>
                 <w:sz w:val="20"/>
                 <w:szCs w:val="20"/>
               </w:rPr>
-              <w:t>Processes ,</w:t>
-            </w:r>
-            <w:proofErr w:type="gramEnd"/>
-            <w:r>
-              <w:rPr>
-                <w:rFonts w:ascii="Arial Narrow" w:hAnsi="Arial Narrow"/>
-                <w:b/>
-                <w:sz w:val="20"/>
-                <w:szCs w:val="20"/>
-              </w:rPr>
-              <w:t xml:space="preserve"> Products , and Services</w:t>
-            </w:r>
-          </w:p>
-          <w:p>
-            <w:pPr>
-              <w:ind w:right="-108"/>
-              <w:rPr>
-                <w:rFonts w:ascii="Arial Narrow" w:hAnsi="Arial Narrow"/>
-                <w:b/>
-                <w:sz w:val="20"/>
-                <w:szCs w:val="20"/>
-              </w:rPr>
             </w:pPr>
           </w:p>
         </w:tc>
@@ -6353,21 +6184,7 @@
               <w:rPr>
                 <w:rFonts w:cs="Arial"/>
               </w:rPr>
-              <w:t xml:space="preserve">Organization </w:t>
-            </w:r>
-            <w:proofErr w:type="gramStart"/>
-            <w:r>
-              <w:rPr>
-                <w:rFonts w:cs="Arial"/>
-              </w:rPr>
-              <w:t>ensure</w:t>
-            </w:r>
-            <w:proofErr w:type="gramEnd"/>
-            <w:r>
-              <w:rPr>
-                <w:rFonts w:cs="Arial"/>
-              </w:rPr>
-              <w:t xml:space="preserve"> that outputs that do not conform to their requirements are identified and controlled to prevent their unintended use or delivery</w:t>
+              <w:t>Organization ensure that outputs that do not conform to their requirements are identified and controlled to prevent their unintended use or delivery</w:t>
             </w:r>
           </w:p>
         </w:tc>
@@ -6451,21 +6268,7 @@
               <w:rPr>
                 <w:rFonts w:cs="Arial"/>
               </w:rPr>
-              <w:t xml:space="preserve">Organization </w:t>
-            </w:r>
-            <w:proofErr w:type="gramStart"/>
-            <w:r>
-              <w:rPr>
-                <w:rFonts w:cs="Arial"/>
-              </w:rPr>
-              <w:t>retain</w:t>
-            </w:r>
-            <w:proofErr w:type="gramEnd"/>
-            <w:r>
-              <w:rPr>
-                <w:rFonts w:cs="Arial"/>
-              </w:rPr>
-              <w:t xml:space="preserve"> documented information</w:t>
+              <w:t>Organization retain documented information</w:t>
             </w:r>
           </w:p>
         </w:tc>
@@ -6719,21 +6522,7 @@
               <w:rPr>
                 <w:rFonts w:cs="Calibri"/>
               </w:rPr>
-              <w:t xml:space="preserve">Evidence that the organization has demonstrated and has achieved compliance with </w:t>
-            </w:r>
-            <w:proofErr w:type="gramStart"/>
-            <w:r>
-              <w:rPr>
-                <w:rFonts w:cs="Calibri"/>
-              </w:rPr>
-              <w:t>the  EMS</w:t>
-            </w:r>
-            <w:proofErr w:type="gramEnd"/>
-            <w:r>
-              <w:rPr>
-                <w:rFonts w:cs="Calibri"/>
-              </w:rPr>
-              <w:t xml:space="preserve">, OH&amp;S related legal requirements through its own compliance </w:t>
+              <w:t xml:space="preserve">Evidence that the organization has demonstrated and has achieved compliance with the  EMS, OH&amp;S related legal requirements through its own compliance </w:t>
             </w:r>
             <w:r>
               <w:rPr>
@@ -7034,21 +6823,7 @@
               <w:rPr>
                 <w:rFonts w:cs="Calibri"/>
               </w:rPr>
-              <w:t>(</w:t>
-            </w:r>
-            <w:proofErr w:type="gramStart"/>
-            <w:r>
-              <w:rPr>
-                <w:rFonts w:cs="Calibri"/>
-              </w:rPr>
-              <w:t>including</w:t>
-            </w:r>
-            <w:proofErr w:type="gramEnd"/>
-            <w:r>
-              <w:rPr>
-                <w:rFonts w:cs="Calibri"/>
-              </w:rPr>
-              <w:t xml:space="preserve"> evidence of closure)</w:t>
+              <w:t>(including evidence of closure)</w:t>
             </w:r>
           </w:p>
         </w:tc>
@@ -7544,25 +7319,7 @@
           <w:b/>
           <w:color w:val="FF0000"/>
         </w:rPr>
-        <w:t xml:space="preserve">Status of </w:t>
-      </w:r>
-      <w:proofErr w:type="gramStart"/>
-      <w:r>
-        <w:rPr>
-          <w:rFonts w:cs="Calibri"/>
-          <w:b/>
-          <w:color w:val="FF0000"/>
-        </w:rPr>
-        <w:t>Non Conformities</w:t>
-      </w:r>
-      <w:proofErr w:type="gramEnd"/>
-      <w:r>
-        <w:rPr>
-          <w:rFonts w:cs="Calibri"/>
-          <w:b/>
-          <w:color w:val="FF0000"/>
-        </w:rPr>
-        <w:t xml:space="preserve"> raised</w:t>
+        <w:t>Status of Non Conformities raised</w:t>
       </w:r>
     </w:p>
     <w:tbl>
@@ -8013,21 +7770,7 @@
               <w:rPr>
                 <w:rFonts w:cs="Calibri"/>
               </w:rPr>
-              <w:t xml:space="preserve">To progress your application for registration, please respond to each </w:t>
-            </w:r>
-            <w:proofErr w:type="gramStart"/>
-            <w:r>
-              <w:rPr>
-                <w:rFonts w:cs="Calibri"/>
-              </w:rPr>
-              <w:t>non-conformances</w:t>
-            </w:r>
-            <w:proofErr w:type="gramEnd"/>
-            <w:r>
-              <w:rPr>
-                <w:rFonts w:cs="Calibri"/>
-              </w:rPr>
-              <w:t xml:space="preserve">, with a plan showing proposed actions, timescales and responsibilities for resolution. The organization should consider the root cause of the non-conformance and the potential for related issues in other parts of your system. </w:t>
+              <w:t xml:space="preserve">To progress your application for registration, please respond to each non-conformances, with a plan showing proposed actions, timescales and responsibilities for resolution. The organization should consider the root cause of the non-conformance and the potential for related issues in other parts of your system. </w:t>
             </w:r>
           </w:p>
         </w:tc>
@@ -8074,20 +7817,12 @@
                 <w:lang w:val="en-IN"/>
               </w:rPr>
             </w:pPr>
-            <w:proofErr w:type="gramStart"/>
             <w:r>
               <w:rPr>
                 <w:rFonts w:cs="Calibri"/>
               </w:rPr>
               <w:lastRenderedPageBreak/>
-              <w:t>Date :</w:t>
-            </w:r>
-            <w:proofErr w:type="gramEnd"/>
-            <w:r>
-              <w:rPr>
-                <w:rFonts w:cs="Calibri"/>
-              </w:rPr>
-              <w:t xml:space="preserve">  </w:t>
+              <w:t xml:space="preserve">Date :  </w:t>
             </w:r>
             <w:r>
               <w:t>{{</w:t>
@@ -8120,17 +7855,8 @@
                 <w:rFonts w:cs="Calibri"/>
                 <w:b/>
               </w:rPr>
-              <w:t>Report Submission (</w:t>
-            </w:r>
-            <w:proofErr w:type="gramStart"/>
-            <w:r>
-              <w:rPr>
-                <w:rFonts w:cs="Calibri"/>
-                <w:b/>
-              </w:rPr>
-              <w:t>AGI )</w:t>
-            </w:r>
-            <w:proofErr w:type="gramEnd"/>
+              <w:t>Report Submission (AGI )</w:t>
+            </w:r>
           </w:p>
         </w:tc>
         <w:tc>
@@ -8172,21 +7898,7 @@
               <w:rPr>
                 <w:rFonts w:cs="Calibri"/>
               </w:rPr>
-              <w:t xml:space="preserve">Name of </w:t>
-            </w:r>
-            <w:proofErr w:type="gramStart"/>
-            <w:r>
-              <w:rPr>
-                <w:rFonts w:cs="Calibri"/>
-              </w:rPr>
-              <w:t>Auditor :</w:t>
-            </w:r>
-            <w:proofErr w:type="gramEnd"/>
-            <w:r>
-              <w:rPr>
-                <w:rFonts w:cs="Calibri"/>
-              </w:rPr>
-              <w:t xml:space="preserve"> </w:t>
+              <w:t xml:space="preserve">Name of Auditor : </w:t>
             </w:r>
           </w:p>
           <w:p>
@@ -8235,14 +7947,7 @@
               <w:rPr>
                 <w:rFonts w:cs="Calibri"/>
               </w:rPr>
-              <w:t>Name</w:t>
-            </w:r>
-            <w:proofErr w:type="gramStart"/>
-            <w:r>
-              <w:rPr>
-                <w:rFonts w:cs="Calibri"/>
-              </w:rPr>
-              <w:t xml:space="preserve">: </w:t>
+              <w:t xml:space="preserve">Name: </w:t>
             </w:r>
             <w:r>
               <w:rPr>
@@ -8255,14 +7960,7 @@
               <w:rPr>
                 <w:rFonts w:cs="Arial"/>
               </w:rPr>
-              <w:t>{</w:t>
-            </w:r>
-            <w:proofErr w:type="gramEnd"/>
-            <w:r>
-              <w:rPr>
-                <w:rFonts w:cs="Arial"/>
-              </w:rPr>
-              <w:t>{</w:t>
+              <w:t>{{</w:t>
             </w:r>
             <w:proofErr w:type="spellStart"/>
             <w:r>
@@ -8305,6 +8003,74 @@
         </w:tc>
       </w:tr>
     </w:tbl>
+    <w:p>
+      <w:pPr>
+        <w:rPr>
+          <w:i/>
+          <w:iCs/>
+          <w:sz w:val="20"/>
+          <w:szCs w:val="20"/>
+        </w:rPr>
+      </w:pPr>
+    </w:p>
+    <w:p>
+      <w:pPr>
+        <w:rPr>
+          <w:rFonts w:ascii="Times New Roman" w:hAnsi="Times New Roman"/>
+          <w:sz w:val="24"/>
+          <w:szCs w:val="24"/>
+        </w:rPr>
+      </w:pPr>
+      <w:r>
+        <w:rPr>
+          <w:i/>
+          <w:iCs/>
+          <w:sz w:val="20"/>
+          <w:szCs w:val="20"/>
+        </w:rPr>
+        <w:t xml:space="preserve">Ownership- This Audit Report is the Property of Accurate Global INC. This should be </w:t>
+      </w:r>
+      <w:proofErr w:type="spellStart"/>
+      <w:r>
+        <w:rPr>
+          <w:i/>
+          <w:iCs/>
+          <w:sz w:val="20"/>
+          <w:szCs w:val="20"/>
+        </w:rPr>
+        <w:t>immidiately</w:t>
+      </w:r>
+      <w:proofErr w:type="spellEnd"/>
+      <w:r>
+        <w:rPr>
+          <w:i/>
+          <w:iCs/>
+          <w:sz w:val="20"/>
+          <w:szCs w:val="20"/>
+        </w:rPr>
+        <w:t xml:space="preserve"> returned back to AGI in the event of </w:t>
+      </w:r>
+      <w:proofErr w:type="spellStart"/>
+      <w:r>
+        <w:rPr>
+          <w:i/>
+          <w:iCs/>
+          <w:sz w:val="20"/>
+          <w:szCs w:val="20"/>
+        </w:rPr>
+        <w:t>expiry,suspension</w:t>
+      </w:r>
+      <w:proofErr w:type="spellEnd"/>
+      <w:r>
+        <w:rPr>
+          <w:i/>
+          <w:iCs/>
+          <w:sz w:val="20"/>
+          <w:szCs w:val="20"/>
+        </w:rPr>
+        <w:t>, withdrawn, termination of the certification Contract. Any misuse, alteration, counterfeiting of this report shall result in legal actions by AGI</w:t>
+      </w:r>
+    </w:p>
     <w:p>
       <w:pPr>
         <w:rPr>

</xml_diff>